<commit_message>
Update Risk R2: replace Onboarding-Hürde with Datenschutz/DSGVO
PoC mitigation: Consent-Screen im Onboarding (US-4 AC4/AC5).
Pre-v1.0 obligations: AVV mit Anthropic, Keychain-Wipe (Art. 17).

Co-Authored-By: Claude Sonnet 4.6 <noreply@anthropic.com>
</commit_message>
<xml_diff>
--- a/FitBuddy_Requirements.docx
+++ b/FitBuddy_Requirements.docx
@@ -5078,7 +5078,7 @@
         <w:pStyle w:val="Heading2"/>
       </w:pPr>
       <w:r>
-        <w:t>R2 — Onboarding-Hürde für Nicht-Techniker (Persona Jana)</w:t>
+        <w:t>R2 — Datenschutz &amp; DSGVO</w:t>
       </w:r>
     </w:p>
     <w:p>
@@ -5092,7 +5092,7 @@
     </w:p>
     <w:p>
       <w:r>
-        <w:t xml:space="preserve">Das Onboarding verlangt zwei API-Keys (Hevy + Claude). Für Jana bedeutet das: Anthropic-Konto erstellen, Kreditkarte hinterlegen, API-Key aus der Console kopieren. Conversion-Rate realistisch nahe Null ohne geführten Flow.</w:t>
+        <w:t xml:space="preserve">Trainingsdaten sind in der EU potenziell Gesundheitsdaten (DSGVO Art. 9 — besondere Kategorie). Jeder AI-Analyse-Call überträgt diese Daten an Anthropic (USA). Offene Punkte: Auftragsverarbeitungsvertrag (AVV) mit Anthropic noch nicht geprüft; «Alle Daten löschen»-Funktion (DSGVO Art. 17, Keychain-Wipe) fehlt noch; Datenexport (Art. 20) nicht implementiert.</w:t>
       </w:r>
     </w:p>
     <w:p/>
@@ -5107,7 +5107,7 @@
     </w:p>
     <w:p>
       <w:r>
-        <w:t xml:space="preserve">US-4 als Must-have mit 5 Acceptance Criteria. Onboarding mit Screenshots und direktem Link zur Key-Seite. Claude-Key im ersten Schritt überspringbar (US-4 AC2) — AI-Feature nachrüstbar.</w:t>
+        <w:t xml:space="preserve">Für den PoC (TestFlight / Sideload, keine öffentliche Veröffentlichung) ist der Consent-Screen im Onboarding (US-4 AC4/AC5) ausreichend: User bestätigt explizit die Übertragung an Anthropic und übernimmt Eigenverantwortung. Vor v1.0-Launch obligatorisch: AVV mit Anthropic abschliessen, Keychain-Wipe als «Delete all data»-Funktion implementieren.</w:t>
       </w:r>
     </w:p>
     <w:p/>

</xml_diff>